<commit_message>
publish student projects (Fall 2026) 2026-09-22 19:16
</commit_message>
<xml_diff>
--- a/Games/contagion.docx
+++ b/Games/contagion.docx
@@ -2133,13 +2133,55 @@
         <w:rPr>
           <w:b/>
         </w:rPr>
-        <w:t xml:space="preserve">Recommended composition:</w:t>
-      </w:r>
-      <w:r>
-        <w:t xml:space="preserve"> </w:t>
-      </w:r>
-      <w:r>
-        <w:t xml:space="preserve">6 CS + 1 Design + 2 Art (9) — a story-driven survival platformer with a player, a dog companion, two enemy types, a ruined-city environment across 5 levels and heavy hazard/animation/VFX demand makes character + environment + animation art the big slot need (2 artists); a solo designer owns the survival loop, level and puzzle design, the resource economy and the 4-ending narrative (rules: min 1 Design mandated, max 9 total, D+A ≤ 3; see</w:t>
+        <w:t xml:space="preserve">Team composition (set by instructor):</w:t>
+      </w:r>
+      <w:r>
+        <w:t xml:space="preserve"> </w:t>
+      </w:r>
+      <w:r>
+        <w:t xml:space="preserve">6 CS + 1 Design + 0 Art (7) — a story-driven survival platformer with a player, a dog companion, two enemy types, a ruined-city environment across 5 levels and heavy hazard/animation/VFX demand is a large character + environment + animation art surface that now has</w:t>
+      </w:r>
+      <w:r>
+        <w:t xml:space="preserve"> </w:t>
+      </w:r>
+      <w:r>
+        <w:rPr>
+          <w:b/>
+        </w:rPr>
+        <w:t xml:space="preserve">no artist</w:t>
+      </w:r>
+      <w:r>
+        <w:t xml:space="preserve">, so the single designer owns the survival loop, level/puzzle design and the 4-ending narrative</w:t>
+      </w:r>
+      <w:r>
+        <w:t xml:space="preserve"> </w:t>
+      </w:r>
+      <w:r>
+        <w:rPr>
+          <w:i/>
+        </w:rPr>
+        <w:t xml:space="preserve">and</w:t>
+      </w:r>
+      <w:r>
+        <w:t xml:space="preserve"> </w:t>
+      </w:r>
+      <w:r>
+        <w:t xml:space="preserve">takes the</w:t>
+      </w:r>
+      <w:r>
+        <w:t xml:space="preserve"> </w:t>
+      </w:r>
+      <w:r>
+        <w:rPr>
+          <w:b/>
+        </w:rPr>
+        <w:t xml:space="preserve">D11 conditional</w:t>
+      </w:r>
+      <w:r>
+        <w:t xml:space="preserve"> </w:t>
+      </w:r>
+      <w:r>
+        <w:t xml:space="preserve">as a real graded Design goal each milestone (M1 Art Proof of Concept / M2 Art Implementation Quality — the last Design goal each milestone), which consumes one Design+UI slot per milestone (rules: min 1 Design mandated, max 9 total, D+A ≤ 3; see</w:t>
       </w:r>
       <w:r>
         <w:t xml:space="preserve"> </w:t>
@@ -2152,6 +2194,21 @@
       </w:r>
       <w:r>
         <w:t xml:space="preserve">).</w:t>
+      </w:r>
+      <w:r>
+        <w:t xml:space="preserve"> </w:t>
+      </w:r>
+      <w:r>
+        <w:rPr>
+          <w:b/>
+        </w:rPr>
+        <w:t xml:space="preserve">Art-risk flag:</w:t>
+      </w:r>
+      <w:r>
+        <w:t xml:space="preserve"> </w:t>
+      </w:r>
+      <w:r>
+        <w:t xml:space="preserve">this is a very art- and animation-forward game (character roster + ruined-city environment + hazard/VFX + the 4 ending cutscenes), so 0 artists is a serious risk — scope levels/roster hard and lean on a reusable silhouette-first style under D11, or reconsider adding an artist within the D+A ≤ 3 cap (a solo designer + 0 artists is the case the design pool flags, and squeezes the designer's systems/balance goals).</w:t>
       </w:r>
       <w:r>
         <w:t xml:space="preserve"> </w:t>
@@ -2234,7 +2291,7 @@
         <w:pStyle w:val="Compact"/>
       </w:pPr>
       <w:r>
-        <w:t xml:space="preserve">M1D6 Systems &amp; Economy Design (survival resources — torchlight/food/items — vs. hazard/enemy pressure; the timed-puzzle pressure from the cannibals)</w:t>
+        <w:t xml:space="preserve">M1D11 Art Proof of Concept *(conditional — no artist; Design-owned)* — the visual direction: the player + dog companion, the two enemy types, the ruined-city environment and the hazard/VFX look; 2 mockups. *(Replaces the M1D6 economy-design slot the artist's absence consumes.)*</w:t>
       </w:r>
     </w:p>
     <w:p>
@@ -2273,7 +2330,7 @@
         <w:pStyle w:val="Compact"/>
       </w:pPr>
       <w:r>
-        <w:t xml:space="preserve">M2D3 Systems Balance &amp; Tuning — Data-Driven (hazard difficulty, enemy aggression and puzzle timers via the team's JSON, no code changes)</w:t>
+        <w:t xml:space="preserve">M2D11 Art Implementation Quality *(conditional — no artist; Design-owned)* — the player + dog, the two enemies, the ruined-city levels, hazards and VFX implemented in-engine, no placeholders.</w:t>
       </w:r>
     </w:p>
     <w:p>
@@ -2360,85 +2417,13 @@
         <w:rPr>
           <w:b/>
         </w:rPr>
-        <w:t xml:space="preserve">Art M1:</w:t>
-      </w:r>
-      <w:r>
-        <w:t xml:space="preserve"> </w:t>
-      </w:r>
-      <w:r>
-        <w:t xml:space="preserve">2 artists justified (character roster + ruined-city environment + heavy animation/VFX)</w:t>
-      </w:r>
-    </w:p>
-    <w:p>
-      <w:pPr>
-        <w:numPr>
-          <w:ilvl w:val="1"/>
-          <w:numId w:val="1022"/>
-        </w:numPr>
-        <w:pStyle w:val="Compact"/>
-      </w:pPr>
-      <w:r>
-        <w:t xml:space="preserve">M1A1 ⭐ (mockups: main menu + a ruined-city level in play)</w:t>
-      </w:r>
-    </w:p>
-    <w:p>
-      <w:pPr>
-        <w:numPr>
-          <w:ilvl w:val="1"/>
-          <w:numId w:val="1022"/>
-        </w:numPr>
-        <w:pStyle w:val="Compact"/>
-      </w:pPr>
-      <w:r>
-        <w:t xml:space="preserve">M1A2 Characters (player, the dog, + the 2 enemy types — infected creature &amp; cannibal human, silhouette-first)</w:t>
-      </w:r>
-    </w:p>
-    <w:p>
-      <w:pPr>
-        <w:numPr>
-          <w:ilvl w:val="1"/>
-          <w:numId w:val="1022"/>
-        </w:numPr>
-        <w:pStyle w:val="Compact"/>
-      </w:pPr>
-      <w:r>
-        <w:t xml:space="preserve">M1A3 Environment (collapsed-city tileset &amp; backdrops — debris, wiring, fire)</w:t>
-      </w:r>
-    </w:p>
-    <w:p>
-      <w:pPr>
-        <w:numPr>
-          <w:ilvl w:val="1"/>
-          <w:numId w:val="1022"/>
-        </w:numPr>
-        <w:pStyle w:val="Compact"/>
-      </w:pPr>
-      <w:r>
-        <w:t xml:space="preserve">M1A4 UI Art Concepts &amp; Typography (health/stamina, dog-command, inventory HUD)</w:t>
-      </w:r>
-    </w:p>
-    <w:p>
-      <w:pPr>
-        <w:numPr>
-          <w:ilvl w:val="1"/>
-          <w:numId w:val="1022"/>
-        </w:numPr>
-        <w:pStyle w:val="Compact"/>
-      </w:pPr>
-      <w:r>
-        <w:t xml:space="preserve">M1A5 Animation Foundations (run/jump/climb, dog follow/scout, enemy idle/chase)</w:t>
-      </w:r>
-    </w:p>
-    <w:p>
-      <w:pPr>
-        <w:numPr>
-          <w:ilvl w:val="1"/>
-          <w:numId w:val="1022"/>
-        </w:numPr>
-        <w:pStyle w:val="Compact"/>
-      </w:pPr>
-      <w:r>
-        <w:t xml:space="preserve">M1A6 Early Asset Production</w:t>
+        <w:t xml:space="preserve">Art:</w:t>
+      </w:r>
+      <w:r>
+        <w:t xml:space="preserve"> </w:t>
+      </w:r>
+      <w:r>
+        <w:t xml:space="preserve">0 artists — the large art/animation surface (the player + dog + 2 enemies, the ruined-city environment, hazards/VFX and the 4 ending cutscenes) is covered by the D11 conditionals, taken as Design goals by the single designer (see Design M1/M2). This is a very art-forward game, so 0 artists is a serious risk — scope levels/roster hard and lean on a reusable silhouette-first style.</w:t>
       </w:r>
     </w:p>
     <w:p>
@@ -2453,79 +2438,31 @@
         <w:rPr>
           <w:b/>
         </w:rPr>
-        <w:t xml:space="preserve">Art M2:</w:t>
-      </w:r>
-    </w:p>
-    <w:p>
-      <w:pPr>
-        <w:numPr>
-          <w:ilvl w:val="1"/>
-          <w:numId w:val="1023"/>
-        </w:numPr>
-        <w:pStyle w:val="Compact"/>
-      </w:pPr>
-      <w:r>
-        <w:t xml:space="preserve">M2A1 ⭐</w:t>
-      </w:r>
-    </w:p>
-    <w:p>
-      <w:pPr>
-        <w:numPr>
-          <w:ilvl w:val="1"/>
-          <w:numId w:val="1023"/>
-        </w:numPr>
-        <w:pStyle w:val="Compact"/>
-      </w:pPr>
-      <w:r>
-        <w:t xml:space="preserve">M2A2 Extensive Animation (climb/traversal set, dog scout/alert, enemy attacks &amp; deaths)</w:t>
-      </w:r>
-    </w:p>
-    <w:p>
-      <w:pPr>
-        <w:numPr>
-          <w:ilvl w:val="1"/>
-          <w:numId w:val="1023"/>
-        </w:numPr>
-        <w:pStyle w:val="Compact"/>
-      </w:pPr>
-      <w:r>
-        <w:t xml:space="preserve">M2A3 Environment Alive (parallax ruins, flooding, ambient fire/smoke motion)</w:t>
-      </w:r>
-    </w:p>
-    <w:p>
-      <w:pPr>
-        <w:numPr>
-          <w:ilvl w:val="1"/>
-          <w:numId w:val="1023"/>
-        </w:numPr>
-        <w:pStyle w:val="Compact"/>
-      </w:pPr>
-      <w:r>
-        <w:t xml:space="preserve">M2A4 UI Art — States &amp; Feedback (low-health/stamina, threat alerts, resource pickups)</w:t>
-      </w:r>
-    </w:p>
-    <w:p>
-      <w:pPr>
-        <w:numPr>
-          <w:ilvl w:val="1"/>
-          <w:numId w:val="1023"/>
-        </w:numPr>
-        <w:pStyle w:val="Compact"/>
-      </w:pPr>
-      <w:r>
-        <w:t xml:space="preserve">M2A5 VFX — Effects &amp; Transitions (debris/cave-ins, fire, water, threat stingers)</w:t>
-      </w:r>
-    </w:p>
-    <w:p>
-      <w:pPr>
-        <w:numPr>
-          <w:ilvl w:val="1"/>
-          <w:numId w:val="1023"/>
-        </w:numPr>
-        <w:pStyle w:val="Compact"/>
-      </w:pPr>
-      <w:r>
-        <w:t xml:space="preserve">M2A6 Cutscenes &amp; Storyboards (intro + the 4 ending sequences)</w:t>
+        <w:t xml:space="preserve">TEAM M1:</w:t>
+      </w:r>
+    </w:p>
+    <w:p>
+      <w:pPr>
+        <w:numPr>
+          <w:ilvl w:val="1"/>
+          <w:numId w:val="1022"/>
+        </w:numPr>
+        <w:pStyle w:val="Compact"/>
+      </w:pPr>
+      <w:r>
+        <w:t xml:space="preserve">M1TA1 ⭐ Overall Audio Experience — initial BGM/SFX from the week-5 needs list present &amp; working in the prototype (oppressive underground ambience, footsteps/dog, aftershock rumble, enemy stings), suitable and correctly triggered.</w:t>
+      </w:r>
+    </w:p>
+    <w:p>
+      <w:pPr>
+        <w:numPr>
+          <w:ilvl w:val="1"/>
+          <w:numId w:val="1022"/>
+        </w:numPr>
+        <w:pStyle w:val="Compact"/>
+      </w:pPr>
+      <w:r>
+        <w:t xml:space="preserve">M1TA2 ⭐ Audio Engine Functionality — data-driven audio pipeline (add/replace files without recompiling) + reliable multi-channel playback (overlapping hazard/enemy/ambience SFX).</w:t>
       </w:r>
     </w:p>
     <w:p>
@@ -2540,45 +2477,6 @@
         <w:rPr>
           <w:b/>
         </w:rPr>
-        <w:t xml:space="preserve">TEAM M1:</w:t>
-      </w:r>
-    </w:p>
-    <w:p>
-      <w:pPr>
-        <w:numPr>
-          <w:ilvl w:val="1"/>
-          <w:numId w:val="1024"/>
-        </w:numPr>
-        <w:pStyle w:val="Compact"/>
-      </w:pPr>
-      <w:r>
-        <w:t xml:space="preserve">M1TA1 ⭐ Overall Audio Experience — initial BGM/SFX from the week-5 needs list present &amp; working in the prototype (oppressive underground ambience, footsteps/dog, aftershock rumble, enemy stings), suitable and correctly triggered.</w:t>
-      </w:r>
-    </w:p>
-    <w:p>
-      <w:pPr>
-        <w:numPr>
-          <w:ilvl w:val="1"/>
-          <w:numId w:val="1024"/>
-        </w:numPr>
-        <w:pStyle w:val="Compact"/>
-      </w:pPr>
-      <w:r>
-        <w:t xml:space="preserve">M1TA2 ⭐ Audio Engine Functionality — data-driven audio pipeline (add/replace files without recompiling) + reliable multi-channel playback (overlapping hazard/enemy/ambience SFX).</w:t>
-      </w:r>
-    </w:p>
-    <w:p>
-      <w:pPr>
-        <w:numPr>
-          <w:ilvl w:val="0"/>
-          <w:numId w:val="1017"/>
-        </w:numPr>
-        <w:pStyle w:val="Compact"/>
-      </w:pPr>
-      <w:r>
-        <w:rPr>
-          <w:b/>
-        </w:rPr>
         <w:t xml:space="preserve">TEAM M2:</w:t>
       </w:r>
     </w:p>
@@ -2586,7 +2484,7 @@
       <w:pPr>
         <w:numPr>
           <w:ilvl w:val="1"/>
-          <w:numId w:val="1025"/>
+          <w:numId w:val="1023"/>
         </w:numPr>
         <w:pStyle w:val="Compact"/>
       </w:pPr>
@@ -2598,7 +2496,7 @@
       <w:pPr>
         <w:numPr>
           <w:ilvl w:val="1"/>
-          <w:numId w:val="1025"/>
+          <w:numId w:val="1023"/>
         </w:numPr>
         <w:pStyle w:val="Compact"/>
       </w:pPr>
@@ -2610,7 +2508,7 @@
       <w:pPr>
         <w:numPr>
           <w:ilvl w:val="1"/>
-          <w:numId w:val="1025"/>
+          <w:numId w:val="1023"/>
         </w:numPr>
         <w:pStyle w:val="Compact"/>
       </w:pPr>
@@ -2955,12 +2853,6 @@
     <w:abstractNumId w:val="991"/>
   </w:num>
   <w:num w:numId="1023">
-    <w:abstractNumId w:val="991"/>
-  </w:num>
-  <w:num w:numId="1024">
-    <w:abstractNumId w:val="991"/>
-  </w:num>
-  <w:num w:numId="1025">
     <w:abstractNumId w:val="991"/>
   </w:num>
 </w:numbering>

</xml_diff>